<commit_message>
Updating Lab 1, Lecture 5, Lecture 6
</commit_message>
<xml_diff>
--- a/BIOS_SSII_Syllabus.docx
+++ b/BIOS_SSII_Syllabus.docx
@@ -1157,19 +1157,7 @@
               <w:rPr>
                 <w:rFonts w:cs="Segoe UI"/>
               </w:rPr>
-              <w:t>HW1 (</w:t>
-            </w:r>
-            <w:r>
-              <w:rPr>
-                <w:rFonts w:cs="Segoe UI"/>
-              </w:rPr>
-              <w:t>lab 1</w:t>
-            </w:r>
-            <w:r>
-              <w:rPr>
-                <w:rFonts w:cs="Segoe UI"/>
-              </w:rPr>
-              <w:t>)</w:t>
+              <w:t xml:space="preserve">HW1 </w:t>
             </w:r>
           </w:p>
         </w:tc>
@@ -1235,19 +1223,7 @@
               <w:rPr>
                 <w:rFonts w:cs="Segoe UI"/>
               </w:rPr>
-              <w:t>HW2 (</w:t>
-            </w:r>
-            <w:r>
-              <w:rPr>
-                <w:rFonts w:cs="Segoe UI"/>
-              </w:rPr>
-              <w:t>hw1 exercises 1-4</w:t>
-            </w:r>
-            <w:r>
-              <w:rPr>
-                <w:rFonts w:cs="Segoe UI"/>
-              </w:rPr>
-              <w:t>)</w:t>
+              <w:t xml:space="preserve">HW2 </w:t>
             </w:r>
           </w:p>
         </w:tc>
@@ -1306,19 +1282,7 @@
               <w:rPr>
                 <w:rFonts w:cs="Segoe UI"/>
               </w:rPr>
-              <w:t>HW3 (</w:t>
-            </w:r>
-            <w:r>
-              <w:rPr>
-                <w:rFonts w:cs="Segoe UI"/>
-              </w:rPr>
-              <w:t>hw1 exercises 5-7, hw2 exercise 1</w:t>
-            </w:r>
-            <w:r>
-              <w:rPr>
-                <w:rFonts w:cs="Segoe UI"/>
-              </w:rPr>
-              <w:t>)</w:t>
+              <w:t xml:space="preserve">HW3 </w:t>
             </w:r>
           </w:p>
         </w:tc>
@@ -1508,6 +1472,26 @@
               <w:rPr>
                 <w:rFonts w:cs="Segoe UI"/>
               </w:rPr>
+              <w:t xml:space="preserve"> + some basic </w:t>
+            </w:r>
+            <w:proofErr w:type="spellStart"/>
+            <w:r>
+              <w:rPr>
+                <w:rFonts w:cs="Segoe UI"/>
+              </w:rPr>
+              <w:t>dplyr</w:t>
+            </w:r>
+            <w:proofErr w:type="spellEnd"/>
+            <w:r>
+              <w:rPr>
+                <w:rFonts w:cs="Segoe UI"/>
+              </w:rPr>
+              <w:t xml:space="preserve"> Qs</w:t>
+            </w:r>
+            <w:r>
+              <w:rPr>
+                <w:rFonts w:cs="Segoe UI"/>
+              </w:rPr>
               <w:t>)</w:t>
             </w:r>
           </w:p>
@@ -1587,22 +1571,36 @@
               <w:rPr>
                 <w:rFonts w:cs="Segoe UI"/>
               </w:rPr>
-              <w:t xml:space="preserve"> 3, exercises 2-4 (+maybe a bonus </w:t>
+              <w:t xml:space="preserve"> 3, exercises 2-4</w:t>
+            </w:r>
+            <w:r>
+              <w:rPr>
+                <w:rFonts w:cs="Segoe UI"/>
+              </w:rPr>
+              <w:t xml:space="preserve"> + a couple </w:t>
             </w:r>
             <w:proofErr w:type="spellStart"/>
             <w:r>
               <w:rPr>
                 <w:rFonts w:cs="Segoe UI"/>
               </w:rPr>
-              <w:t>tidyverse</w:t>
+              <w:t>dplyr</w:t>
             </w:r>
             <w:proofErr w:type="spellEnd"/>
             <w:r>
               <w:rPr>
                 <w:rFonts w:cs="Segoe UI"/>
               </w:rPr>
-              <w:t xml:space="preserve"> q?)</w:t>
-            </w:r>
+              <w:t xml:space="preserve"> </w:t>
+            </w:r>
+            <w:proofErr w:type="spellStart"/>
+            <w:r>
+              <w:rPr>
+                <w:rFonts w:cs="Segoe UI"/>
+              </w:rPr>
+              <w:t>qs</w:t>
+            </w:r>
+            <w:proofErr w:type="spellEnd"/>
             <w:r>
               <w:rPr>
                 <w:rFonts w:cs="Segoe UI"/>
@@ -1695,35 +1693,7 @@
               <w:rPr>
                 <w:rFonts w:cs="Segoe UI"/>
               </w:rPr>
-              <w:t xml:space="preserve"> 3 exercise 1, exercise 5 (+ maybe a couple </w:t>
-            </w:r>
-            <w:proofErr w:type="spellStart"/>
-            <w:r>
-              <w:rPr>
-                <w:rFonts w:cs="Segoe UI"/>
-              </w:rPr>
-              <w:t>tidyverse</w:t>
-            </w:r>
-            <w:proofErr w:type="spellEnd"/>
-            <w:r>
-              <w:rPr>
-                <w:rFonts w:cs="Segoe UI"/>
-              </w:rPr>
-              <w:t xml:space="preserve"> </w:t>
-            </w:r>
-            <w:proofErr w:type="spellStart"/>
-            <w:r>
-              <w:rPr>
-                <w:rFonts w:cs="Segoe UI"/>
-              </w:rPr>
-              <w:t>qs</w:t>
-            </w:r>
-            <w:proofErr w:type="spellEnd"/>
-            <w:r>
-              <w:rPr>
-                <w:rFonts w:cs="Segoe UI"/>
-              </w:rPr>
-              <w:t>?)</w:t>
+              <w:t xml:space="preserve"> 3 exercise 1, exercise 5</w:t>
             </w:r>
           </w:p>
           <w:p>
@@ -1744,12 +1714,6 @@
                 <w:rFonts w:cs="Segoe UI"/>
               </w:rPr>
               <w:t>review questions</w:t>
-            </w:r>
-            <w:r>
-              <w:rPr>
-                <w:rFonts w:cs="Segoe UI"/>
-              </w:rPr>
-              <w:t>)</w:t>
             </w:r>
           </w:p>
         </w:tc>
@@ -2399,7 +2363,6 @@
               <w:rPr>
                 <w:rFonts w:cs="Segoe UI"/>
               </w:rPr>
-              <w:lastRenderedPageBreak/>
               <w:t>Wednesday, July 15</w:t>
             </w:r>
           </w:p>
@@ -2508,6 +2471,7 @@
               <w:rPr>
                 <w:rFonts w:cs="Segoe UI"/>
               </w:rPr>
+              <w:lastRenderedPageBreak/>
               <w:t>Thursday, July 16</w:t>
             </w:r>
           </w:p>
@@ -3436,41 +3400,41 @@
           <w:rStyle w:val="textlayer--absolute"/>
           <w:rFonts w:cs="Segoe UI"/>
         </w:rPr>
-        <w:t xml:space="preserve">/LaTeX installed, you can </w:t>
+        <w:t>/LaTeX installed, you can render directly to PDF.) The instructor will review this process early in the class. You are</w:t>
+      </w:r>
+      <w:r>
+        <w:rPr>
+          <w:rFonts w:cs="Segoe UI"/>
+        </w:rPr>
+        <w:t xml:space="preserve"> </w:t>
       </w:r>
       <w:r>
         <w:rPr>
           <w:rStyle w:val="textlayer--absolute"/>
           <w:rFonts w:cs="Segoe UI"/>
         </w:rPr>
+        <w:t>welcome to discuss strategies of problem solving with each other or myself, but the work you</w:t>
+      </w:r>
+      <w:r>
+        <w:rPr>
+          <w:rFonts w:cs="Segoe UI"/>
+        </w:rPr>
+        <w:t xml:space="preserve"> </w:t>
+      </w:r>
+      <w:r>
+        <w:rPr>
+          <w:rStyle w:val="textlayer--absolute"/>
+          <w:rFonts w:cs="Segoe UI"/>
+        </w:rPr>
+        <w:t xml:space="preserve">turn in must be your own. Copying answers and/or code will be considered a violation of the UNC Honor Code. The lowest homework grade will be dropped. Each student’s homework should </w:t>
+      </w:r>
+      <w:r>
+        <w:rPr>
+          <w:rStyle w:val="textlayer--absolute"/>
+          <w:rFonts w:cs="Segoe UI"/>
+        </w:rPr>
         <w:lastRenderedPageBreak/>
-        <w:t>render directly to PDF.) The instructor will review this process early in the class. You are</w:t>
-      </w:r>
-      <w:r>
-        <w:rPr>
-          <w:rFonts w:cs="Segoe UI"/>
-        </w:rPr>
-        <w:t xml:space="preserve"> </w:t>
-      </w:r>
-      <w:r>
-        <w:rPr>
-          <w:rStyle w:val="textlayer--absolute"/>
-          <w:rFonts w:cs="Segoe UI"/>
-        </w:rPr>
-        <w:t>welcome to discuss strategies of problem solving with each other or myself, but the work you</w:t>
-      </w:r>
-      <w:r>
-        <w:rPr>
-          <w:rFonts w:cs="Segoe UI"/>
-        </w:rPr>
-        <w:t xml:space="preserve"> </w:t>
-      </w:r>
-      <w:r>
-        <w:rPr>
-          <w:rStyle w:val="textlayer--absolute"/>
-          <w:rFonts w:cs="Segoe UI"/>
-        </w:rPr>
-        <w:t>turn in must be your own. Copying answers and/or code will be considered a violation of the UNC Honor Code. The lowest homework grade will be dropped. Each student’s homework should have their name at the top. (Instructions for how to add your name to a Quarto document will be given during the first lecture).</w:t>
+        <w:t>have their name at the top. (Instructions for how to add your name to a Quarto document will be given during the first lecture).</w:t>
       </w:r>
     </w:p>
     <w:p>
@@ -3636,18 +3600,21 @@
         <w:pStyle w:val="Heading2"/>
       </w:pPr>
       <w:r>
+        <w:t>Late work policy</w:t>
+      </w:r>
+    </w:p>
+    <w:p>
+      <w:pPr>
+        <w:rPr>
+          <w:rStyle w:val="textlayer--absolute"/>
+        </w:rPr>
+      </w:pPr>
+      <w:r>
+        <w:t xml:space="preserve">The due dates for assignments are there to help you keep up with the course material and to ensure that you are provided with feedback in a timely manner. We understand that things come up periodically that could make it difficult to submit an assignment by the deadline. Note </w:t>
+      </w:r>
+      <w:r>
         <w:lastRenderedPageBreak/>
-        <w:t>Late work policy</w:t>
-      </w:r>
-    </w:p>
-    <w:p>
-      <w:pPr>
-        <w:rPr>
-          <w:rStyle w:val="textlayer--absolute"/>
-        </w:rPr>
-      </w:pPr>
-      <w:r>
-        <w:t xml:space="preserve">The due dates for assignments are there to help you keep up with the course material and to ensure that you are provided with feedback in a timely manner. We understand that things come up periodically that could make it difficult to submit an assignment by the deadline. Note that the lowest homework will be dropped to accommodate such circumstances. </w:t>
+        <w:t xml:space="preserve">that the lowest homework will be dropped to accommodate such circumstances. </w:t>
       </w:r>
       <w:r>
         <w:t xml:space="preserve">All HW and Lab assignments are due at 11:59 PM on the </w:t>

</xml_diff>

<commit_message>
Updated lab 3, added lecture 13
</commit_message>
<xml_diff>
--- a/BIOS_SSII_Syllabus.docx
+++ b/BIOS_SSII_Syllabus.docx
@@ -1808,39 +1808,7 @@
               <w:rPr>
                 <w:rFonts w:cs="Segoe UI"/>
               </w:rPr>
-              <w:t>HW7 (</w:t>
-            </w:r>
-            <w:proofErr w:type="spellStart"/>
-            <w:r>
-              <w:rPr>
-                <w:rFonts w:cs="Segoe UI"/>
-              </w:rPr>
-              <w:t>hw</w:t>
-            </w:r>
-            <w:proofErr w:type="spellEnd"/>
-            <w:r>
-              <w:rPr>
-                <w:rFonts w:cs="Segoe UI"/>
-              </w:rPr>
-              <w:t xml:space="preserve"> 4</w:t>
-            </w:r>
-            <w:r>
-              <w:rPr>
-                <w:rFonts w:cs="Segoe UI"/>
-              </w:rPr>
-              <w:t xml:space="preserve"> 1-3</w:t>
-            </w:r>
-            <w:r>
-              <w:rPr>
-                <w:rFonts w:cs="Segoe UI"/>
-              </w:rPr>
-              <w:t>)</w:t>
-            </w:r>
-            <w:r>
-              <w:rPr>
-                <w:rFonts w:cs="Segoe UI"/>
-              </w:rPr>
-              <w:t xml:space="preserve"> </w:t>
+              <w:t xml:space="preserve">HW7 </w:t>
             </w:r>
           </w:p>
         </w:tc>
@@ -1899,33 +1867,7 @@
               <w:rPr>
                 <w:rFonts w:cs="Segoe UI"/>
               </w:rPr>
-              <w:t>HW8 (</w:t>
-            </w:r>
-            <w:r>
-              <w:rPr>
-                <w:rFonts w:cs="Segoe UI"/>
-              </w:rPr>
-              <w:t xml:space="preserve">hw4 4-5, </w:t>
-            </w:r>
-            <w:proofErr w:type="spellStart"/>
-            <w:r>
-              <w:rPr>
-                <w:rFonts w:cs="Segoe UI"/>
-              </w:rPr>
-              <w:t>hw</w:t>
-            </w:r>
-            <w:proofErr w:type="spellEnd"/>
-            <w:r>
-              <w:rPr>
-                <w:rFonts w:cs="Segoe UI"/>
-              </w:rPr>
-              <w:t xml:space="preserve"> 5 exercise 1</w:t>
-            </w:r>
-            <w:r>
-              <w:rPr>
-                <w:rFonts w:cs="Segoe UI"/>
-              </w:rPr>
-              <w:t>)</w:t>
+              <w:t xml:space="preserve">HW8 </w:t>
             </w:r>
           </w:p>
         </w:tc>
@@ -1984,27 +1926,7 @@
               <w:rPr>
                 <w:rFonts w:cs="Segoe UI"/>
               </w:rPr>
-              <w:t>HW9 (</w:t>
-            </w:r>
-            <w:proofErr w:type="spellStart"/>
-            <w:r>
-              <w:rPr>
-                <w:rFonts w:cs="Segoe UI"/>
-              </w:rPr>
-              <w:t>hw</w:t>
-            </w:r>
-            <w:proofErr w:type="spellEnd"/>
-            <w:r>
-              <w:rPr>
-                <w:rFonts w:cs="Segoe UI"/>
-              </w:rPr>
-              <w:t xml:space="preserve"> 5 exercises 2-5</w:t>
-            </w:r>
-            <w:r>
-              <w:rPr>
-                <w:rFonts w:cs="Segoe UI"/>
-              </w:rPr>
-              <w:t>)</w:t>
+              <w:t xml:space="preserve">HW9 </w:t>
             </w:r>
           </w:p>
         </w:tc>
@@ -2201,7 +2123,7 @@
               <w:rPr>
                 <w:rFonts w:cs="Segoe UI"/>
               </w:rPr>
-              <w:t xml:space="preserve"> (+ review time)</w:t>
+              <w:t>, Two continuous variables</w:t>
             </w:r>
           </w:p>
         </w:tc>
@@ -2462,23 +2384,8 @@
             <w:r>
               <w:rPr>
                 <w:rFonts w:cs="Segoe UI"/>
-                <w:highlight w:val="yellow"/>
-              </w:rPr>
-              <w:t>Lab 7 (correlation)</w:t>
-            </w:r>
-            <w:r>
-              <w:rPr>
-                <w:rFonts w:cs="Segoe UI"/>
-              </w:rPr>
-              <w:t xml:space="preserve"> </w:t>
-            </w:r>
-            <w:r>
-              <w:rPr>
-                <w:rFonts w:cs="Segoe UI"/>
-                <w:i/>
-                <w:iCs/>
-              </w:rPr>
-              <w:t>could I maybe do lecture on two continuous here?</w:t>
+              </w:rPr>
+              <w:t>Correlation analysis</w:t>
             </w:r>
           </w:p>
         </w:tc>
@@ -10712,10 +10619,6 @@
 </file>
 
 <file path=customXml/item1.xml><?xml version="1.0" encoding="utf-8"?>
-<b:Sources xmlns:b="http://schemas.openxmlformats.org/officeDocument/2006/bibliography" xmlns="http://schemas.openxmlformats.org/officeDocument/2006/bibliography" SelectedStyle="\APASixthEditionOfficeOnline.xsl" StyleName="APA" Version="6"/>
-</file>
-
-<file path=customXml/item2.xml><?xml version="1.0" encoding="utf-8"?>
 <p:properties xmlns:p="http://schemas.microsoft.com/office/2006/metadata/properties" xmlns:xsi="http://www.w3.org/2001/XMLSchema-instance" xmlns:pc="http://schemas.microsoft.com/office/infopath/2007/PartnerControls">
   <documentManagement>
     <lcf76f155ced4ddcb4097134ff3c332f xmlns="3ffb3a4a-2774-4688-92b0-4550673b6351">
@@ -10726,7 +10629,20 @@
 </p:properties>
 </file>
 
+<file path=customXml/item2.xml><?xml version="1.0" encoding="utf-8"?>
+<b:Sources xmlns:b="http://schemas.openxmlformats.org/officeDocument/2006/bibliography" xmlns="http://schemas.openxmlformats.org/officeDocument/2006/bibliography" SelectedStyle="\APASixthEditionOfficeOnline.xsl" StyleName="APA" Version="6"/>
+</file>
+
 <file path=customXml/item3.xml><?xml version="1.0" encoding="utf-8"?>
+<?mso-contentType ?>
+<FormTemplates xmlns="http://schemas.microsoft.com/sharepoint/v3/contenttype/forms">
+  <Display>DocumentLibraryForm</Display>
+  <Edit>DocumentLibraryForm</Edit>
+  <New>DocumentLibraryForm</New>
+</FormTemplates>
+</file>
+
+<file path=customXml/item4.xml><?xml version="1.0" encoding="utf-8"?>
 <ct:contentTypeSchema xmlns:ct="http://schemas.microsoft.com/office/2006/metadata/contentType" xmlns:ma="http://schemas.microsoft.com/office/2006/metadata/properties/metaAttributes" ct:_="" ma:_="" ma:contentTypeName="Document" ma:contentTypeID="0x010100409464087D5B4C418CC715FA6999E664" ma:contentTypeVersion="18" ma:contentTypeDescription="Create a new document." ma:contentTypeScope="" ma:versionID="59fdb6b62616c222a904c38450a3550b">
   <xsd:schema xmlns:xsd="http://www.w3.org/2001/XMLSchema" xmlns:xs="http://www.w3.org/2001/XMLSchema" xmlns:p="http://schemas.microsoft.com/office/2006/metadata/properties" xmlns:ns2="3ffb3a4a-2774-4688-92b0-4550673b6351" xmlns:ns3="07342c55-8c63-4c46-b66d-7ab2a3553aac" targetNamespace="http://schemas.microsoft.com/office/2006/metadata/properties" ma:root="true" ma:fieldsID="5132900f66832d7a036145f830e6d642" ns2:_="" ns3:_="">
     <xsd:import namespace="3ffb3a4a-2774-4688-92b0-4550673b6351"/>
@@ -10981,24 +10897,7 @@
 </ct:contentTypeSchema>
 </file>
 
-<file path=customXml/item4.xml><?xml version="1.0" encoding="utf-8"?>
-<?mso-contentType ?>
-<FormTemplates xmlns="http://schemas.microsoft.com/sharepoint/v3/contenttype/forms">
-  <Display>DocumentLibraryForm</Display>
-  <Edit>DocumentLibraryForm</Edit>
-  <New>DocumentLibraryForm</New>
-</FormTemplates>
-</file>
-
 <file path=customXml/itemProps1.xml><?xml version="1.0" encoding="utf-8"?>
-<ds:datastoreItem xmlns:ds="http://schemas.openxmlformats.org/officeDocument/2006/customXml" ds:itemID="{4CC5C727-A11B-4D82-A01C-A4807FD013A8}">
-  <ds:schemaRefs>
-    <ds:schemaRef ds:uri="http://schemas.openxmlformats.org/officeDocument/2006/bibliography"/>
-  </ds:schemaRefs>
-</ds:datastoreItem>
-</file>
-
-<file path=customXml/itemProps2.xml><?xml version="1.0" encoding="utf-8"?>
 <ds:datastoreItem xmlns:ds="http://schemas.openxmlformats.org/officeDocument/2006/customXml" ds:itemID="{DBECFF31-3D5F-42D0-8C04-E37BD43D5642}">
   <ds:schemaRefs>
     <ds:schemaRef ds:uri="http://schemas.microsoft.com/office/2006/metadata/properties"/>
@@ -11009,7 +10908,23 @@
 </ds:datastoreItem>
 </file>
 
+<file path=customXml/itemProps2.xml><?xml version="1.0" encoding="utf-8"?>
+<ds:datastoreItem xmlns:ds="http://schemas.openxmlformats.org/officeDocument/2006/customXml" ds:itemID="{4CC5C727-A11B-4D82-A01C-A4807FD013A8}">
+  <ds:schemaRefs>
+    <ds:schemaRef ds:uri="http://schemas.openxmlformats.org/officeDocument/2006/bibliography"/>
+  </ds:schemaRefs>
+</ds:datastoreItem>
+</file>
+
 <file path=customXml/itemProps3.xml><?xml version="1.0" encoding="utf-8"?>
+<ds:datastoreItem xmlns:ds="http://schemas.openxmlformats.org/officeDocument/2006/customXml" ds:itemID="{426E3791-75D0-4B70-8AFE-FD56F41DF88C}">
+  <ds:schemaRefs>
+    <ds:schemaRef ds:uri="http://schemas.microsoft.com/sharepoint/v3/contenttype/forms"/>
+  </ds:schemaRefs>
+</ds:datastoreItem>
+</file>
+
+<file path=customXml/itemProps4.xml><?xml version="1.0" encoding="utf-8"?>
 <ds:datastoreItem xmlns:ds="http://schemas.openxmlformats.org/officeDocument/2006/customXml" ds:itemID="{D01A363F-A6D7-4E79-8051-213B49D901E3}">
   <ds:schemaRefs>
     <ds:schemaRef ds:uri="http://schemas.microsoft.com/office/2006/metadata/contentType"/>
@@ -11026,12 +10941,4 @@
     <ds:schemaRef ds:uri="http://schemas.microsoft.com/internal/obd"/>
   </ds:schemaRefs>
 </ds:datastoreItem>
-</file>
-
-<file path=customXml/itemProps4.xml><?xml version="1.0" encoding="utf-8"?>
-<ds:datastoreItem xmlns:ds="http://schemas.openxmlformats.org/officeDocument/2006/customXml" ds:itemID="{426E3791-75D0-4B70-8AFE-FD56F41DF88C}">
-  <ds:schemaRefs>
-    <ds:schemaRef ds:uri="http://schemas.microsoft.com/sharepoint/v3/contenttype/forms"/>
-  </ds:schemaRefs>
-</ds:datastoreItem>
 </file>
</xml_diff>

<commit_message>
Updating website index and syllabus
</commit_message>
<xml_diff>
--- a/BIOS_SSII_Syllabus.docx
+++ b/BIOS_SSII_Syllabus.docx
@@ -408,20 +408,13 @@
         </w:rPr>
         <w:t xml:space="preserve"> </w:t>
       </w:r>
-      <w:r>
-        <w:rPr>
-          <w:rStyle w:val="textlayer--absolute"/>
-          <w:rFonts w:cs="Segoe UI"/>
-        </w:rPr>
-        <w:t>webpage (</w:t>
-      </w:r>
       <w:hyperlink r:id="rId13" w:history="1">
         <w:r>
           <w:rPr>
             <w:rStyle w:val="Hyperlink"/>
             <w:rFonts w:cs="Segoe UI"/>
           </w:rPr>
-          <w:t>http://sph.unc.edu/bios/courses/</w:t>
+          <w:t>webpage</w:t>
         </w:r>
       </w:hyperlink>
       <w:r>
@@ -429,7 +422,14 @@
           <w:rStyle w:val="textlayer--absolute"/>
           <w:rFonts w:cs="Segoe UI"/>
         </w:rPr>
-        <w:t>). The document</w:t>
+        <w:t xml:space="preserve">. </w:t>
+      </w:r>
+      <w:r>
+        <w:rPr>
+          <w:rStyle w:val="textlayer--absolute"/>
+          <w:rFonts w:cs="Segoe UI"/>
+        </w:rPr>
+        <w:t>The document</w:t>
       </w:r>
       <w:r>
         <w:rPr>
@@ -1507,7 +1507,13 @@
               <w:rPr>
                 <w:rFonts w:cs="Segoe UI"/>
               </w:rPr>
-              <w:t xml:space="preserve">HW5 </w:t>
+              <w:t>HW5</w:t>
+            </w:r>
+            <w:r>
+              <w:rPr>
+                <w:rFonts w:cs="Segoe UI"/>
+              </w:rPr>
+              <w:t>, AE1</w:t>
             </w:r>
           </w:p>
           <w:p>
@@ -1969,6 +1975,12 @@
               </w:rPr>
               <w:t>Visualizing spatial data</w:t>
             </w:r>
+            <w:r>
+              <w:rPr>
+                <w:rFonts w:cs="Segoe UI"/>
+              </w:rPr>
+              <w:t xml:space="preserve"> and Coding Style</w:t>
+            </w:r>
           </w:p>
         </w:tc>
         <w:tc>
@@ -1985,27 +1997,7 @@
               <w:rPr>
                 <w:rFonts w:cs="Segoe UI"/>
               </w:rPr>
-              <w:t>HW10 (</w:t>
-            </w:r>
-            <w:proofErr w:type="spellStart"/>
-            <w:r>
-              <w:rPr>
-                <w:rFonts w:cs="Segoe UI"/>
-              </w:rPr>
-              <w:t>hw</w:t>
-            </w:r>
-            <w:proofErr w:type="spellEnd"/>
-            <w:r>
-              <w:rPr>
-                <w:rFonts w:cs="Segoe UI"/>
-              </w:rPr>
-              <w:t xml:space="preserve"> 6 exercises 1, 3-4</w:t>
-            </w:r>
-            <w:r>
-              <w:rPr>
-                <w:rFonts w:cs="Segoe UI"/>
-              </w:rPr>
-              <w:t>)</w:t>
+              <w:t xml:space="preserve">HW10 </w:t>
             </w:r>
           </w:p>
         </w:tc>
@@ -2064,19 +2056,7 @@
               <w:rPr>
                 <w:rFonts w:cs="Segoe UI"/>
               </w:rPr>
-              <w:t>Lab 2 (</w:t>
-            </w:r>
-            <w:r>
-              <w:rPr>
-                <w:rFonts w:cs="Segoe UI"/>
-              </w:rPr>
-              <w:t>lab 5</w:t>
-            </w:r>
-            <w:r>
-              <w:rPr>
-                <w:rFonts w:cs="Segoe UI"/>
-              </w:rPr>
-              <w:t>)</w:t>
+              <w:t xml:space="preserve">Lab 2 </w:t>
             </w:r>
           </w:p>
         </w:tc>
@@ -2142,27 +2122,7 @@
               <w:rPr>
                 <w:rFonts w:cs="Segoe UI"/>
               </w:rPr>
-              <w:t>HW11 (</w:t>
-            </w:r>
-            <w:proofErr w:type="spellStart"/>
-            <w:r>
-              <w:rPr>
-                <w:rFonts w:cs="Segoe UI"/>
-              </w:rPr>
-              <w:t>hw</w:t>
-            </w:r>
-            <w:proofErr w:type="spellEnd"/>
-            <w:r>
-              <w:rPr>
-                <w:rFonts w:cs="Segoe UI"/>
-              </w:rPr>
-              <w:t xml:space="preserve"> 6 exercises 2, 6</w:t>
-            </w:r>
-            <w:r>
-              <w:rPr>
-                <w:rFonts w:cs="Segoe UI"/>
-              </w:rPr>
-              <w:t>)</w:t>
+              <w:t xml:space="preserve">HW11 </w:t>
             </w:r>
           </w:p>
         </w:tc>
@@ -2228,21 +2188,7 @@
               <w:rPr>
                 <w:rFonts w:cs="Segoe UI"/>
               </w:rPr>
-              <w:t>HW12 (</w:t>
-            </w:r>
-            <w:proofErr w:type="spellStart"/>
-            <w:r>
-              <w:rPr>
-                <w:rFonts w:cs="Segoe UI"/>
-              </w:rPr>
-              <w:t>hw</w:t>
-            </w:r>
-            <w:proofErr w:type="spellEnd"/>
-            <w:r>
-              <w:rPr>
-                <w:rFonts w:cs="Segoe UI"/>
-              </w:rPr>
-              <w:t xml:space="preserve"> 6 exercise 5</w:t>
+              <w:t xml:space="preserve">HW12 </w:t>
             </w:r>
           </w:p>
           <w:p>
@@ -2252,26 +2198,6 @@
                 <w:rFonts w:cs="Segoe UI"/>
               </w:rPr>
             </w:pPr>
-          </w:p>
-          <w:p>
-            <w:pPr>
-              <w:keepNext/>
-              <w:rPr>
-                <w:rFonts w:cs="Segoe UI"/>
-              </w:rPr>
-            </w:pPr>
-            <w:r>
-              <w:rPr>
-                <w:rFonts w:cs="Segoe UI"/>
-              </w:rPr>
-              <w:t>review questions</w:t>
-            </w:r>
-            <w:r>
-              <w:rPr>
-                <w:rFonts w:cs="Segoe UI"/>
-              </w:rPr>
-              <w:t>)</w:t>
-            </w:r>
           </w:p>
         </w:tc>
       </w:tr>
@@ -2427,7 +2353,6 @@
               <w:rPr>
                 <w:rFonts w:cs="Segoe UI"/>
               </w:rPr>
-              <w:lastRenderedPageBreak/>
               <w:t>Monday, July 20</w:t>
             </w:r>
           </w:p>
@@ -2471,19 +2396,7 @@
               <w:rPr>
                 <w:rFonts w:cs="Segoe UI"/>
               </w:rPr>
-              <w:t>Lab 3 (</w:t>
-            </w:r>
-            <w:r>
-              <w:rPr>
-                <w:rFonts w:cs="Segoe UI"/>
-              </w:rPr>
-              <w:t>lab 7</w:t>
-            </w:r>
-            <w:r>
-              <w:rPr>
-                <w:rFonts w:cs="Segoe UI"/>
-              </w:rPr>
-              <w:t>)</w:t>
+              <w:t xml:space="preserve">Lab 3 </w:t>
             </w:r>
           </w:p>
         </w:tc>
@@ -2506,6 +2419,7 @@
               <w:rPr>
                 <w:rFonts w:cs="Segoe UI"/>
               </w:rPr>
+              <w:lastRenderedPageBreak/>
               <w:t>Tuesday, July 21</w:t>
             </w:r>
           </w:p>
@@ -2556,12 +2470,6 @@
                 <w:rFonts w:cs="Segoe UI"/>
               </w:rPr>
               <w:t xml:space="preserve">HW13 </w:t>
-            </w:r>
-            <w:r>
-              <w:rPr>
-                <w:rFonts w:cs="Segoe UI"/>
-              </w:rPr>
-              <w:t>(some questions from lab 9)</w:t>
             </w:r>
           </w:p>
         </w:tc>
@@ -2627,19 +2535,7 @@
               <w:rPr>
                 <w:rFonts w:cs="Segoe UI"/>
               </w:rPr>
-              <w:t>HW14 (</w:t>
-            </w:r>
-            <w:r>
-              <w:rPr>
-                <w:rFonts w:cs="Segoe UI"/>
-              </w:rPr>
-              <w:t>lab 8 (?)</w:t>
-            </w:r>
-            <w:r>
-              <w:rPr>
-                <w:rFonts w:cs="Segoe UI"/>
-              </w:rPr>
-              <w:t>)</w:t>
+              <w:t xml:space="preserve">HW14 </w:t>
             </w:r>
           </w:p>
         </w:tc>
@@ -2712,12 +2608,6 @@
                 <w:rFonts w:cs="Segoe UI"/>
               </w:rPr>
               <w:t xml:space="preserve">HW15 </w:t>
-            </w:r>
-            <w:r>
-              <w:rPr>
-                <w:rFonts w:cs="Segoe UI"/>
-              </w:rPr>
-              <w:t>(some questions from lab 10)</w:t>
             </w:r>
           </w:p>
         </w:tc>
@@ -3348,10 +3238,10 @@
     </w:p>
     <w:p>
       <w:r>
-        <w:t>Participation exercises are graded by completion</w:t>
-      </w:r>
-      <w:r>
-        <w:t>.</w:t>
+        <w:t xml:space="preserve">Participation exercises </w:t>
+      </w:r>
+      <w:r>
+        <w:t>will appear in several forms, including (but not limited to) short written reflections, group work on applications of concepts, and more involved coding exercises.</w:t>
       </w:r>
     </w:p>
     <w:p>
@@ -3426,14 +3316,14 @@
         <w:t xml:space="preserve">All HW and Lab assignments are due at 11:59 PM on the </w:t>
       </w:r>
       <w:r>
-        <w:t>day listed in the Course-at-a-Glance, but can be handed in by 11:59 AM the next day with a 5% penalty</w:t>
-      </w:r>
-      <w:r>
-        <w:t xml:space="preserve">; students are encouraged to use this </w:t>
+        <w:t xml:space="preserve">day listed in the Course-at-a-Glance, but can be </w:t>
       </w:r>
       <w:r>
         <w:lastRenderedPageBreak/>
-        <w:t>grace period only under extenuating circumstances, as this is a fast-paced course with near-daily assignments.</w:t>
+        <w:t>handed in by 11:59 AM the next day with a 5% penalty</w:t>
+      </w:r>
+      <w:r>
+        <w:t>; students are encouraged to use this grace period only under extenuating circumstances, as this is a fast-paced course with near-daily assignments.</w:t>
       </w:r>
     </w:p>
     <w:p>
@@ -10629,10 +10519,19 @@
 </file>
 
 <file path=customXml/item1.xml><?xml version="1.0" encoding="utf-8"?>
+<?mso-contentType ?>
+<FormTemplates xmlns="http://schemas.microsoft.com/sharepoint/v3/contenttype/forms">
+  <Display>DocumentLibraryForm</Display>
+  <Edit>DocumentLibraryForm</Edit>
+  <New>DocumentLibraryForm</New>
+</FormTemplates>
+</file>
+
+<file path=customXml/item2.xml><?xml version="1.0" encoding="utf-8"?>
 <b:Sources xmlns:b="http://schemas.openxmlformats.org/officeDocument/2006/bibliography" xmlns="http://schemas.openxmlformats.org/officeDocument/2006/bibliography" SelectedStyle="\APASixthEditionOfficeOnline.xsl" StyleName="APA" Version="6"/>
 </file>
 
-<file path=customXml/item2.xml><?xml version="1.0" encoding="utf-8"?>
+<file path=customXml/item3.xml><?xml version="1.0" encoding="utf-8"?>
 <p:properties xmlns:p="http://schemas.microsoft.com/office/2006/metadata/properties" xmlns:xsi="http://www.w3.org/2001/XMLSchema-instance" xmlns:pc="http://schemas.microsoft.com/office/infopath/2007/PartnerControls">
   <documentManagement>
     <lcf76f155ced4ddcb4097134ff3c332f xmlns="3ffb3a4a-2774-4688-92b0-4550673b6351">
@@ -10643,7 +10542,7 @@
 </p:properties>
 </file>
 
-<file path=customXml/item3.xml><?xml version="1.0" encoding="utf-8"?>
+<file path=customXml/item4.xml><?xml version="1.0" encoding="utf-8"?>
 <ct:contentTypeSchema xmlns:ct="http://schemas.microsoft.com/office/2006/metadata/contentType" xmlns:ma="http://schemas.microsoft.com/office/2006/metadata/properties/metaAttributes" ct:_="" ma:_="" ma:contentTypeName="Document" ma:contentTypeID="0x010100409464087D5B4C418CC715FA6999E664" ma:contentTypeVersion="18" ma:contentTypeDescription="Create a new document." ma:contentTypeScope="" ma:versionID="59fdb6b62616c222a904c38450a3550b">
   <xsd:schema xmlns:xsd="http://www.w3.org/2001/XMLSchema" xmlns:xs="http://www.w3.org/2001/XMLSchema" xmlns:p="http://schemas.microsoft.com/office/2006/metadata/properties" xmlns:ns2="3ffb3a4a-2774-4688-92b0-4550673b6351" xmlns:ns3="07342c55-8c63-4c46-b66d-7ab2a3553aac" targetNamespace="http://schemas.microsoft.com/office/2006/metadata/properties" ma:root="true" ma:fieldsID="5132900f66832d7a036145f830e6d642" ns2:_="" ns3:_="">
     <xsd:import namespace="3ffb3a4a-2774-4688-92b0-4550673b6351"/>
@@ -10898,16 +10797,15 @@
 </ct:contentTypeSchema>
 </file>
 
-<file path=customXml/item4.xml><?xml version="1.0" encoding="utf-8"?>
-<?mso-contentType ?>
-<FormTemplates xmlns="http://schemas.microsoft.com/sharepoint/v3/contenttype/forms">
-  <Display>DocumentLibraryForm</Display>
-  <Edit>DocumentLibraryForm</Edit>
-  <New>DocumentLibraryForm</New>
-</FormTemplates>
+<file path=customXml/itemProps1.xml><?xml version="1.0" encoding="utf-8"?>
+<ds:datastoreItem xmlns:ds="http://schemas.openxmlformats.org/officeDocument/2006/customXml" ds:itemID="{426E3791-75D0-4B70-8AFE-FD56F41DF88C}">
+  <ds:schemaRefs>
+    <ds:schemaRef ds:uri="http://schemas.microsoft.com/sharepoint/v3/contenttype/forms"/>
+  </ds:schemaRefs>
+</ds:datastoreItem>
 </file>
 
-<file path=customXml/itemProps1.xml><?xml version="1.0" encoding="utf-8"?>
+<file path=customXml/itemProps2.xml><?xml version="1.0" encoding="utf-8"?>
 <ds:datastoreItem xmlns:ds="http://schemas.openxmlformats.org/officeDocument/2006/customXml" ds:itemID="{4CC5C727-A11B-4D82-A01C-A4807FD013A8}">
   <ds:schemaRefs>
     <ds:schemaRef ds:uri="http://schemas.openxmlformats.org/officeDocument/2006/bibliography"/>
@@ -10915,7 +10813,7 @@
 </ds:datastoreItem>
 </file>
 
-<file path=customXml/itemProps2.xml><?xml version="1.0" encoding="utf-8"?>
+<file path=customXml/itemProps3.xml><?xml version="1.0" encoding="utf-8"?>
 <ds:datastoreItem xmlns:ds="http://schemas.openxmlformats.org/officeDocument/2006/customXml" ds:itemID="{DBECFF31-3D5F-42D0-8C04-E37BD43D5642}">
   <ds:schemaRefs>
     <ds:schemaRef ds:uri="http://schemas.microsoft.com/office/2006/metadata/properties"/>
@@ -10926,7 +10824,7 @@
 </ds:datastoreItem>
 </file>
 
-<file path=customXml/itemProps3.xml><?xml version="1.0" encoding="utf-8"?>
+<file path=customXml/itemProps4.xml><?xml version="1.0" encoding="utf-8"?>
 <ds:datastoreItem xmlns:ds="http://schemas.openxmlformats.org/officeDocument/2006/customXml" ds:itemID="{D01A363F-A6D7-4E79-8051-213B49D901E3}">
   <ds:schemaRefs>
     <ds:schemaRef ds:uri="http://schemas.microsoft.com/office/2006/metadata/contentType"/>
@@ -10943,12 +10841,4 @@
     <ds:schemaRef ds:uri="http://schemas.microsoft.com/internal/obd"/>
   </ds:schemaRefs>
 </ds:datastoreItem>
-</file>
-
-<file path=customXml/itemProps4.xml><?xml version="1.0" encoding="utf-8"?>
-<ds:datastoreItem xmlns:ds="http://schemas.openxmlformats.org/officeDocument/2006/customXml" ds:itemID="{426E3791-75D0-4B70-8AFE-FD56F41DF88C}">
-  <ds:schemaRefs>
-    <ds:schemaRef ds:uri="http://schemas.microsoft.com/sharepoint/v3/contenttype/forms"/>
-  </ds:schemaRefs>
-</ds:datastoreItem>
 </file>
</xml_diff>

<commit_message>
Updating office hours, adding exam 1 review
</commit_message>
<xml_diff>
--- a/BIOS_SSII_Syllabus.docx
+++ b/BIOS_SSII_Syllabus.docx
@@ -572,7 +572,49 @@
         <w:rPr>
           <w:rFonts w:cs="Segoe UI"/>
         </w:rPr>
-        <w:t xml:space="preserve">Mondays and Wednesdays 1-3 PM, or by </w:t>
+        <w:t xml:space="preserve">Mondays and Wednesdays </w:t>
+      </w:r>
+      <w:r>
+        <w:rPr>
+          <w:rFonts w:cs="Segoe UI"/>
+        </w:rPr>
+        <w:t>1</w:t>
+      </w:r>
+      <w:r>
+        <w:rPr>
+          <w:rFonts w:cs="Segoe UI"/>
+        </w:rPr>
+        <w:t>1</w:t>
+      </w:r>
+      <w:r>
+        <w:rPr>
+          <w:rFonts w:cs="Segoe UI"/>
+        </w:rPr>
+        <w:t xml:space="preserve"> AM</w:t>
+      </w:r>
+      <w:r>
+        <w:rPr>
+          <w:rFonts w:cs="Segoe UI"/>
+        </w:rPr>
+        <w:t>-</w:t>
+      </w:r>
+      <w:r>
+        <w:rPr>
+          <w:rFonts w:cs="Segoe UI"/>
+        </w:rPr>
+        <w:t>1</w:t>
+      </w:r>
+      <w:r>
+        <w:rPr>
+          <w:rFonts w:cs="Segoe UI"/>
+        </w:rPr>
+        <w:t xml:space="preserve"> PM, or by </w:t>
+      </w:r>
+      <w:r>
+        <w:rPr>
+          <w:rFonts w:cs="Segoe UI"/>
+        </w:rPr>
+        <w:t>appointment.</w:t>
       </w:r>
     </w:p>
     <w:p>
@@ -10519,6 +10561,10 @@
 </file>
 
 <file path=customXml/item1.xml><?xml version="1.0" encoding="utf-8"?>
+<b:Sources xmlns:b="http://schemas.openxmlformats.org/officeDocument/2006/bibliography" xmlns="http://schemas.openxmlformats.org/officeDocument/2006/bibliography" SelectedStyle="\APASixthEditionOfficeOnline.xsl" StyleName="APA" Version="6"/>
+</file>
+
+<file path=customXml/item2.xml><?xml version="1.0" encoding="utf-8"?>
 <?mso-contentType ?>
 <FormTemplates xmlns="http://schemas.microsoft.com/sharepoint/v3/contenttype/forms">
   <Display>DocumentLibraryForm</Display>
@@ -10527,22 +10573,7 @@
 </FormTemplates>
 </file>
 
-<file path=customXml/item2.xml><?xml version="1.0" encoding="utf-8"?>
-<b:Sources xmlns:b="http://schemas.openxmlformats.org/officeDocument/2006/bibliography" xmlns="http://schemas.openxmlformats.org/officeDocument/2006/bibliography" SelectedStyle="\APASixthEditionOfficeOnline.xsl" StyleName="APA" Version="6"/>
-</file>
-
 <file path=customXml/item3.xml><?xml version="1.0" encoding="utf-8"?>
-<p:properties xmlns:p="http://schemas.microsoft.com/office/2006/metadata/properties" xmlns:xsi="http://www.w3.org/2001/XMLSchema-instance" xmlns:pc="http://schemas.microsoft.com/office/infopath/2007/PartnerControls">
-  <documentManagement>
-    <lcf76f155ced4ddcb4097134ff3c332f xmlns="3ffb3a4a-2774-4688-92b0-4550673b6351">
-      <Terms xmlns="http://schemas.microsoft.com/office/infopath/2007/PartnerControls"/>
-    </lcf76f155ced4ddcb4097134ff3c332f>
-    <TaxCatchAll xmlns="07342c55-8c63-4c46-b66d-7ab2a3553aac" xsi:nil="true"/>
-  </documentManagement>
-</p:properties>
-</file>
-
-<file path=customXml/item4.xml><?xml version="1.0" encoding="utf-8"?>
 <ct:contentTypeSchema xmlns:ct="http://schemas.microsoft.com/office/2006/metadata/contentType" xmlns:ma="http://schemas.microsoft.com/office/2006/metadata/properties/metaAttributes" ct:_="" ma:_="" ma:contentTypeName="Document" ma:contentTypeID="0x010100409464087D5B4C418CC715FA6999E664" ma:contentTypeVersion="18" ma:contentTypeDescription="Create a new document." ma:contentTypeScope="" ma:versionID="59fdb6b62616c222a904c38450a3550b">
   <xsd:schema xmlns:xsd="http://www.w3.org/2001/XMLSchema" xmlns:xs="http://www.w3.org/2001/XMLSchema" xmlns:p="http://schemas.microsoft.com/office/2006/metadata/properties" xmlns:ns2="3ffb3a4a-2774-4688-92b0-4550673b6351" xmlns:ns3="07342c55-8c63-4c46-b66d-7ab2a3553aac" targetNamespace="http://schemas.microsoft.com/office/2006/metadata/properties" ma:root="true" ma:fieldsID="5132900f66832d7a036145f830e6d642" ns2:_="" ns3:_="">
     <xsd:import namespace="3ffb3a4a-2774-4688-92b0-4550673b6351"/>
@@ -10797,7 +10828,26 @@
 </ct:contentTypeSchema>
 </file>
 
+<file path=customXml/item4.xml><?xml version="1.0" encoding="utf-8"?>
+<p:properties xmlns:p="http://schemas.microsoft.com/office/2006/metadata/properties" xmlns:xsi="http://www.w3.org/2001/XMLSchema-instance" xmlns:pc="http://schemas.microsoft.com/office/infopath/2007/PartnerControls">
+  <documentManagement>
+    <lcf76f155ced4ddcb4097134ff3c332f xmlns="3ffb3a4a-2774-4688-92b0-4550673b6351">
+      <Terms xmlns="http://schemas.microsoft.com/office/infopath/2007/PartnerControls"/>
+    </lcf76f155ced4ddcb4097134ff3c332f>
+    <TaxCatchAll xmlns="07342c55-8c63-4c46-b66d-7ab2a3553aac" xsi:nil="true"/>
+  </documentManagement>
+</p:properties>
+</file>
+
 <file path=customXml/itemProps1.xml><?xml version="1.0" encoding="utf-8"?>
+<ds:datastoreItem xmlns:ds="http://schemas.openxmlformats.org/officeDocument/2006/customXml" ds:itemID="{4CC5C727-A11B-4D82-A01C-A4807FD013A8}">
+  <ds:schemaRefs>
+    <ds:schemaRef ds:uri="http://schemas.openxmlformats.org/officeDocument/2006/bibliography"/>
+  </ds:schemaRefs>
+</ds:datastoreItem>
+</file>
+
+<file path=customXml/itemProps2.xml><?xml version="1.0" encoding="utf-8"?>
 <ds:datastoreItem xmlns:ds="http://schemas.openxmlformats.org/officeDocument/2006/customXml" ds:itemID="{426E3791-75D0-4B70-8AFE-FD56F41DF88C}">
   <ds:schemaRefs>
     <ds:schemaRef ds:uri="http://schemas.microsoft.com/sharepoint/v3/contenttype/forms"/>
@@ -10805,26 +10855,7 @@
 </ds:datastoreItem>
 </file>
 
-<file path=customXml/itemProps2.xml><?xml version="1.0" encoding="utf-8"?>
-<ds:datastoreItem xmlns:ds="http://schemas.openxmlformats.org/officeDocument/2006/customXml" ds:itemID="{4CC5C727-A11B-4D82-A01C-A4807FD013A8}">
-  <ds:schemaRefs>
-    <ds:schemaRef ds:uri="http://schemas.openxmlformats.org/officeDocument/2006/bibliography"/>
-  </ds:schemaRefs>
-</ds:datastoreItem>
-</file>
-
 <file path=customXml/itemProps3.xml><?xml version="1.0" encoding="utf-8"?>
-<ds:datastoreItem xmlns:ds="http://schemas.openxmlformats.org/officeDocument/2006/customXml" ds:itemID="{DBECFF31-3D5F-42D0-8C04-E37BD43D5642}">
-  <ds:schemaRefs>
-    <ds:schemaRef ds:uri="http://schemas.microsoft.com/office/2006/metadata/properties"/>
-    <ds:schemaRef ds:uri="http://schemas.microsoft.com/office/infopath/2007/PartnerControls"/>
-    <ds:schemaRef ds:uri="3ffb3a4a-2774-4688-92b0-4550673b6351"/>
-    <ds:schemaRef ds:uri="07342c55-8c63-4c46-b66d-7ab2a3553aac"/>
-  </ds:schemaRefs>
-</ds:datastoreItem>
-</file>
-
-<file path=customXml/itemProps4.xml><?xml version="1.0" encoding="utf-8"?>
 <ds:datastoreItem xmlns:ds="http://schemas.openxmlformats.org/officeDocument/2006/customXml" ds:itemID="{D01A363F-A6D7-4E79-8051-213B49D901E3}">
   <ds:schemaRefs>
     <ds:schemaRef ds:uri="http://schemas.microsoft.com/office/2006/metadata/contentType"/>
@@ -10841,4 +10872,15 @@
     <ds:schemaRef ds:uri="http://schemas.microsoft.com/internal/obd"/>
   </ds:schemaRefs>
 </ds:datastoreItem>
+</file>
+
+<file path=customXml/itemProps4.xml><?xml version="1.0" encoding="utf-8"?>
+<ds:datastoreItem xmlns:ds="http://schemas.openxmlformats.org/officeDocument/2006/customXml" ds:itemID="{DBECFF31-3D5F-42D0-8C04-E37BD43D5642}">
+  <ds:schemaRefs>
+    <ds:schemaRef ds:uri="http://schemas.microsoft.com/office/2006/metadata/properties"/>
+    <ds:schemaRef ds:uri="http://schemas.microsoft.com/office/infopath/2007/PartnerControls"/>
+    <ds:schemaRef ds:uri="3ffb3a4a-2774-4688-92b0-4550673b6351"/>
+    <ds:schemaRef ds:uri="07342c55-8c63-4c46-b66d-7ab2a3553aac"/>
+  </ds:schemaRefs>
+</ds:datastoreItem>
 </file>
</xml_diff>